<commit_message>
updated Next Steps template to remove reference to WebEx
</commit_message>
<xml_diff>
--- a/docassemble/RFApackage/data/templates/RFApackage_next_steps.docx
+++ b/docassemble/RFApackage/data/templates/RFApackage_next_steps.docx
@@ -1,6 +1,6 @@
 
 <file path=word/document.xml><?xml version="1.0" encoding="utf-8"?>
-<w:document xmlns:wpc="http://schemas.microsoft.com/office/word/2010/wordprocessingCanvas" xmlns:cx="http://schemas.microsoft.com/office/drawing/2014/chartex" xmlns:cx1="http://schemas.microsoft.com/office/drawing/2015/9/8/chartex" xmlns:cx2="http://schemas.microsoft.com/office/drawing/2015/10/21/chartex" xmlns:cx3="http://schemas.microsoft.com/office/drawing/2016/5/9/chartex" xmlns:cx4="http://schemas.microsoft.com/office/drawing/2016/5/10/chartex" xmlns:cx5="http://schemas.microsoft.com/office/drawing/2016/5/11/chartex" xmlns:cx6="http://schemas.microsoft.com/office/drawing/2016/5/12/chartex" xmlns:cx7="http://schemas.microsoft.com/office/drawing/2016/5/13/chartex" xmlns:cx8="http://schemas.microsoft.com/office/drawing/2016/5/14/chartex" xmlns:mc="http://schemas.openxmlformats.org/markup-compatibility/2006" xmlns:aink="http://schemas.microsoft.com/office/drawing/2016/ink" xmlns:am3d="http://schemas.microsoft.com/office/drawing/2017/model3d" xmlns:o="urn:schemas-microsoft-com:office:office" xmlns:oel="http://schemas.microsoft.com/office/2019/extlst" xmlns:r="http://schemas.openxmlformats.org/officeDocument/2006/relationships" xmlns:m="http://schemas.openxmlformats.org/officeDocument/2006/math" xmlns:v="urn:schemas-microsoft-com:vml" xmlns:wp14="http://schemas.microsoft.com/office/word/2010/wordprocessingDrawing" xmlns:wp="http://schemas.openxmlformats.org/drawingml/2006/wordprocessingDrawing" xmlns:w10="urn:schemas-microsoft-com:office:word" xmlns:w="http://schemas.openxmlformats.org/wordprocessingml/2006/main" xmlns:w14="http://schemas.microsoft.com/office/word/2010/wordml" xmlns:w15="http://schemas.microsoft.com/office/word/2012/wordml" xmlns:w16cex="http://schemas.microsoft.com/office/word/2018/wordml/cex" xmlns:w16cid="http://schemas.microsoft.com/office/word/2016/wordml/cid" xmlns:w16="http://schemas.microsoft.com/office/word/2018/wordml" xmlns:w16sdtdh="http://schemas.microsoft.com/office/word/2020/wordml/sdtdatahash" xmlns:w16se="http://schemas.microsoft.com/office/word/2015/wordml/symex" xmlns:wpg="http://schemas.microsoft.com/office/word/2010/wordprocessingGroup" xmlns:wpi="http://schemas.microsoft.com/office/word/2010/wordprocessingInk" xmlns:wne="http://schemas.microsoft.com/office/word/2006/wordml" xmlns:wps="http://schemas.microsoft.com/office/word/2010/wordprocessingShape" mc:Ignorable="w14 w15 w16se w16cid w16 w16cex w16sdtdh wp14">
+<w:document xmlns:wpc="http://schemas.microsoft.com/office/word/2010/wordprocessingCanvas" xmlns:cx="http://schemas.microsoft.com/office/drawing/2014/chartex" xmlns:cx1="http://schemas.microsoft.com/office/drawing/2015/9/8/chartex" xmlns:cx2="http://schemas.microsoft.com/office/drawing/2015/10/21/chartex" xmlns:cx3="http://schemas.microsoft.com/office/drawing/2016/5/9/chartex" xmlns:cx4="http://schemas.microsoft.com/office/drawing/2016/5/10/chartex" xmlns:cx5="http://schemas.microsoft.com/office/drawing/2016/5/11/chartex" xmlns:cx6="http://schemas.microsoft.com/office/drawing/2016/5/12/chartex" xmlns:cx7="http://schemas.microsoft.com/office/drawing/2016/5/13/chartex" xmlns:cx8="http://schemas.microsoft.com/office/drawing/2016/5/14/chartex" xmlns:mc="http://schemas.openxmlformats.org/markup-compatibility/2006" xmlns:aink="http://schemas.microsoft.com/office/drawing/2016/ink" xmlns:am3d="http://schemas.microsoft.com/office/drawing/2017/model3d" xmlns:o="urn:schemas-microsoft-com:office:office" xmlns:oel="http://schemas.microsoft.com/office/2019/extlst" xmlns:r="http://schemas.openxmlformats.org/officeDocument/2006/relationships" xmlns:m="http://schemas.openxmlformats.org/officeDocument/2006/math" xmlns:v="urn:schemas-microsoft-com:vml" xmlns:wp14="http://schemas.microsoft.com/office/word/2010/wordprocessingDrawing" xmlns:wp="http://schemas.openxmlformats.org/drawingml/2006/wordprocessingDrawing" xmlns:w10="urn:schemas-microsoft-com:office:word" xmlns:w="http://schemas.openxmlformats.org/wordprocessingml/2006/main" xmlns:w14="http://schemas.microsoft.com/office/word/2010/wordml" xmlns:w15="http://schemas.microsoft.com/office/word/2012/wordml" xmlns:w16cex="http://schemas.microsoft.com/office/word/2018/wordml/cex" xmlns:w16cid="http://schemas.microsoft.com/office/word/2016/wordml/cid" xmlns:w16="http://schemas.microsoft.com/office/word/2018/wordml" xmlns:w16du="http://schemas.microsoft.com/office/word/2023/wordml/word16du" xmlns:w16sdtdh="http://schemas.microsoft.com/office/word/2020/wordml/sdtdatahash" xmlns:w16sdtfl="http://schemas.microsoft.com/office/word/2024/wordml/sdtformatlock" xmlns:w16se="http://schemas.microsoft.com/office/word/2015/wordml/symex" xmlns:wpg="http://schemas.microsoft.com/office/word/2010/wordprocessingGroup" xmlns:wpi="http://schemas.microsoft.com/office/word/2010/wordprocessingInk" xmlns:wne="http://schemas.microsoft.com/office/word/2006/wordml" xmlns:wps="http://schemas.microsoft.com/office/word/2010/wordprocessingShape" mc:Ignorable="w14 w15 w16se w16cid w16 w16cex w16sdtdh w16sdtfl w16du wp14">
   <w:body>
     <w:p>
       <w:pPr>
@@ -10,8 +10,16 @@
         <w:rPr>
           <w:rStyle w:val="Heading1Char"/>
         </w:rPr>
-        <w:t>NEXT STEPS — VTCourtForms</w:t>
-      </w:r>
+        <w:t xml:space="preserve">NEXT STEPS — </w:t>
+      </w:r>
+      <w:proofErr w:type="spellStart"/>
+      <w:r>
+        <w:rPr>
+          <w:rStyle w:val="Heading1Char"/>
+        </w:rPr>
+        <w:t>VTCourtForms</w:t>
+      </w:r>
+      <w:proofErr w:type="spellEnd"/>
       <w:r>
         <w:br/>
       </w:r>
@@ -418,7 +426,23 @@
           <w:b/>
           <w:bCs/>
         </w:rPr>
-        <w:t xml:space="preserve"> address_county </w:t>
+        <w:t xml:space="preserve"> </w:t>
+      </w:r>
+      <w:proofErr w:type="spellStart"/>
+      <w:r>
+        <w:rPr>
+          <w:b/>
+          <w:bCs/>
+        </w:rPr>
+        <w:t>address_county</w:t>
+      </w:r>
+      <w:proofErr w:type="spellEnd"/>
+      <w:r>
+        <w:rPr>
+          <w:b/>
+          <w:bCs/>
+        </w:rPr>
+        <w:t xml:space="preserve"> </w:t>
       </w:r>
       <w:r>
         <w:rPr>
@@ -487,15 +511,63 @@
         <w:br/>
       </w:r>
       <w:r>
-        <w:t>{{ address_address }} {{ address_unit }}</w:t>
+        <w:t xml:space="preserve">{{ </w:t>
+      </w:r>
+      <w:proofErr w:type="spellStart"/>
+      <w:r>
+        <w:t>address_address</w:t>
+      </w:r>
+      <w:proofErr w:type="spellEnd"/>
+      <w:r>
+        <w:t xml:space="preserve"> }} {{ </w:t>
+      </w:r>
+      <w:proofErr w:type="spellStart"/>
+      <w:r>
+        <w:t>address_unit</w:t>
+      </w:r>
+      <w:proofErr w:type="spellEnd"/>
+      <w:r>
+        <w:t xml:space="preserve"> }}</w:t>
       </w:r>
       <w:r>
         <w:br/>
-        <w:t>{{ address_city }}, {{ address_state }} {{ address_zip }}</w:t>
+        <w:t xml:space="preserve">{{ </w:t>
+      </w:r>
+      <w:proofErr w:type="spellStart"/>
+      <w:r>
+        <w:t>address_city</w:t>
+      </w:r>
+      <w:proofErr w:type="spellEnd"/>
+      <w:r>
+        <w:t xml:space="preserve"> }}, {{ </w:t>
+      </w:r>
+      <w:proofErr w:type="spellStart"/>
+      <w:r>
+        <w:t>address_state</w:t>
+      </w:r>
+      <w:proofErr w:type="spellEnd"/>
+      <w:r>
+        <w:t xml:space="preserve"> }} {{ </w:t>
+      </w:r>
+      <w:proofErr w:type="spellStart"/>
+      <w:r>
+        <w:t>address_zip</w:t>
+      </w:r>
+      <w:proofErr w:type="spellEnd"/>
+      <w:r>
+        <w:t xml:space="preserve"> }}</w:t>
       </w:r>
       <w:r>
         <w:br/>
-        <w:t>{% if arbitrary_attribute %}</w:t>
+        <w:t xml:space="preserve">{% if </w:t>
+      </w:r>
+      <w:proofErr w:type="spellStart"/>
+      <w:r>
+        <w:t>arbitrary_attribute</w:t>
+      </w:r>
+      <w:proofErr w:type="spellEnd"/>
+      <w:r>
+        <w:t xml:space="preserve"> %}</w:t>
       </w:r>
       <w:r>
         <w:br/>
@@ -503,7 +575,15 @@
       </w:r>
       <w:r>
         <w:br/>
-        <w:t>{{ arbitrary_attribute }}</w:t>
+        <w:t xml:space="preserve">{{ </w:t>
+      </w:r>
+      <w:proofErr w:type="spellStart"/>
+      <w:r>
+        <w:t>arbitrary_attribute</w:t>
+      </w:r>
+      <w:proofErr w:type="spellEnd"/>
+      <w:r>
+        <w:t xml:space="preserve"> }}</w:t>
       </w:r>
       <w:r>
         <w:br/>
@@ -735,7 +815,19 @@
         <w:t xml:space="preserve"> </w:t>
       </w:r>
       <w:r>
-        <w:t>The hearing may be held in person or remotely by Webex or phone</w:t>
+        <w:t xml:space="preserve">The hearing may be held in person or </w:t>
+      </w:r>
+      <w:r>
+        <w:t>online</w:t>
+      </w:r>
+      <w:r>
+        <w:t xml:space="preserve"> or </w:t>
+      </w:r>
+      <w:r>
+        <w:t xml:space="preserve">by </w:t>
+      </w:r>
+      <w:r>
+        <w:t>phone</w:t>
       </w:r>
       <w:r>
         <w:rPr>
@@ -844,7 +936,13 @@
         <w:t>,</w:t>
       </w:r>
       <w:r>
-        <w:t xml:space="preserve"> be sure to bring 3 copies with you. If you are going by WebEx, you need to file your exhibits in advance. Read the notice of hearing you get from the court and ask the court clerk if you have questions.</w:t>
+        <w:t xml:space="preserve"> be sure to bring 3 copies with you. If you are going </w:t>
+      </w:r>
+      <w:r>
+        <w:t>online</w:t>
+      </w:r>
+      <w:r>
+        <w:t>, you need to file your exhibits in advance. Read the notice of hearing you get from the court and ask the court clerk if you have questions.</w:t>
       </w:r>
     </w:p>
     <w:p>
@@ -1186,7 +1284,7 @@
 </file>
 
 <file path=word/endnotes.xml><?xml version="1.0" encoding="utf-8"?>
-<w:endnotes xmlns:wpc="http://schemas.microsoft.com/office/word/2010/wordprocessingCanvas" xmlns:cx="http://schemas.microsoft.com/office/drawing/2014/chartex" xmlns:cx1="http://schemas.microsoft.com/office/drawing/2015/9/8/chartex" xmlns:cx2="http://schemas.microsoft.com/office/drawing/2015/10/21/chartex" xmlns:cx3="http://schemas.microsoft.com/office/drawing/2016/5/9/chartex" xmlns:cx4="http://schemas.microsoft.com/office/drawing/2016/5/10/chartex" xmlns:cx5="http://schemas.microsoft.com/office/drawing/2016/5/11/chartex" xmlns:cx6="http://schemas.microsoft.com/office/drawing/2016/5/12/chartex" xmlns:cx7="http://schemas.microsoft.com/office/drawing/2016/5/13/chartex" xmlns:cx8="http://schemas.microsoft.com/office/drawing/2016/5/14/chartex" xmlns:mc="http://schemas.openxmlformats.org/markup-compatibility/2006" xmlns:aink="http://schemas.microsoft.com/office/drawing/2016/ink" xmlns:am3d="http://schemas.microsoft.com/office/drawing/2017/model3d" xmlns:o="urn:schemas-microsoft-com:office:office" xmlns:oel="http://schemas.microsoft.com/office/2019/extlst" xmlns:r="http://schemas.openxmlformats.org/officeDocument/2006/relationships" xmlns:m="http://schemas.openxmlformats.org/officeDocument/2006/math" xmlns:v="urn:schemas-microsoft-com:vml" xmlns:wp14="http://schemas.microsoft.com/office/word/2010/wordprocessingDrawing" xmlns:wp="http://schemas.openxmlformats.org/drawingml/2006/wordprocessingDrawing" xmlns:w10="urn:schemas-microsoft-com:office:word" xmlns:w="http://schemas.openxmlformats.org/wordprocessingml/2006/main" xmlns:w14="http://schemas.microsoft.com/office/word/2010/wordml" xmlns:w15="http://schemas.microsoft.com/office/word/2012/wordml" xmlns:w16cex="http://schemas.microsoft.com/office/word/2018/wordml/cex" xmlns:w16cid="http://schemas.microsoft.com/office/word/2016/wordml/cid" xmlns:w16="http://schemas.microsoft.com/office/word/2018/wordml" xmlns:w16sdtdh="http://schemas.microsoft.com/office/word/2020/wordml/sdtdatahash" xmlns:w16se="http://schemas.microsoft.com/office/word/2015/wordml/symex" xmlns:wpg="http://schemas.microsoft.com/office/word/2010/wordprocessingGroup" xmlns:wpi="http://schemas.microsoft.com/office/word/2010/wordprocessingInk" xmlns:wne="http://schemas.microsoft.com/office/word/2006/wordml" xmlns:wps="http://schemas.microsoft.com/office/word/2010/wordprocessingShape" mc:Ignorable="w14 w15 w16se w16cid w16 w16cex w16sdtdh wp14">
+<w:endnotes xmlns:wpc="http://schemas.microsoft.com/office/word/2010/wordprocessingCanvas" xmlns:cx="http://schemas.microsoft.com/office/drawing/2014/chartex" xmlns:cx1="http://schemas.microsoft.com/office/drawing/2015/9/8/chartex" xmlns:cx2="http://schemas.microsoft.com/office/drawing/2015/10/21/chartex" xmlns:cx3="http://schemas.microsoft.com/office/drawing/2016/5/9/chartex" xmlns:cx4="http://schemas.microsoft.com/office/drawing/2016/5/10/chartex" xmlns:cx5="http://schemas.microsoft.com/office/drawing/2016/5/11/chartex" xmlns:cx6="http://schemas.microsoft.com/office/drawing/2016/5/12/chartex" xmlns:cx7="http://schemas.microsoft.com/office/drawing/2016/5/13/chartex" xmlns:cx8="http://schemas.microsoft.com/office/drawing/2016/5/14/chartex" xmlns:mc="http://schemas.openxmlformats.org/markup-compatibility/2006" xmlns:aink="http://schemas.microsoft.com/office/drawing/2016/ink" xmlns:am3d="http://schemas.microsoft.com/office/drawing/2017/model3d" xmlns:o="urn:schemas-microsoft-com:office:office" xmlns:oel="http://schemas.microsoft.com/office/2019/extlst" xmlns:r="http://schemas.openxmlformats.org/officeDocument/2006/relationships" xmlns:m="http://schemas.openxmlformats.org/officeDocument/2006/math" xmlns:v="urn:schemas-microsoft-com:vml" xmlns:wp14="http://schemas.microsoft.com/office/word/2010/wordprocessingDrawing" xmlns:wp="http://schemas.openxmlformats.org/drawingml/2006/wordprocessingDrawing" xmlns:w10="urn:schemas-microsoft-com:office:word" xmlns:w="http://schemas.openxmlformats.org/wordprocessingml/2006/main" xmlns:w14="http://schemas.microsoft.com/office/word/2010/wordml" xmlns:w15="http://schemas.microsoft.com/office/word/2012/wordml" xmlns:w16cex="http://schemas.microsoft.com/office/word/2018/wordml/cex" xmlns:w16cid="http://schemas.microsoft.com/office/word/2016/wordml/cid" xmlns:w16="http://schemas.microsoft.com/office/word/2018/wordml" xmlns:w16du="http://schemas.microsoft.com/office/word/2023/wordml/word16du" xmlns:w16sdtdh="http://schemas.microsoft.com/office/word/2020/wordml/sdtdatahash" xmlns:w16sdtfl="http://schemas.microsoft.com/office/word/2024/wordml/sdtformatlock" xmlns:w16se="http://schemas.microsoft.com/office/word/2015/wordml/symex" xmlns:wpg="http://schemas.microsoft.com/office/word/2010/wordprocessingGroup" xmlns:wpi="http://schemas.microsoft.com/office/word/2010/wordprocessingInk" xmlns:wne="http://schemas.microsoft.com/office/word/2006/wordml" xmlns:wps="http://schemas.microsoft.com/office/word/2010/wordprocessingShape" mc:Ignorable="w14 w15 w16se w16cid w16 w16cex w16sdtdh w16sdtfl w16du wp14">
   <w:endnote w:type="separator" w:id="-1">
     <w:p>
       <w:r>
@@ -1205,7 +1303,7 @@
 </file>
 
 <file path=word/footer1.xml><?xml version="1.0" encoding="utf-8"?>
-<w:ftr xmlns:wpc="http://schemas.microsoft.com/office/word/2010/wordprocessingCanvas" xmlns:cx="http://schemas.microsoft.com/office/drawing/2014/chartex" xmlns:cx1="http://schemas.microsoft.com/office/drawing/2015/9/8/chartex" xmlns:cx2="http://schemas.microsoft.com/office/drawing/2015/10/21/chartex" xmlns:cx3="http://schemas.microsoft.com/office/drawing/2016/5/9/chartex" xmlns:cx4="http://schemas.microsoft.com/office/drawing/2016/5/10/chartex" xmlns:cx5="http://schemas.microsoft.com/office/drawing/2016/5/11/chartex" xmlns:cx6="http://schemas.microsoft.com/office/drawing/2016/5/12/chartex" xmlns:cx7="http://schemas.microsoft.com/office/drawing/2016/5/13/chartex" xmlns:cx8="http://schemas.microsoft.com/office/drawing/2016/5/14/chartex" xmlns:mc="http://schemas.openxmlformats.org/markup-compatibility/2006" xmlns:aink="http://schemas.microsoft.com/office/drawing/2016/ink" xmlns:am3d="http://schemas.microsoft.com/office/drawing/2017/model3d" xmlns:o="urn:schemas-microsoft-com:office:office" xmlns:oel="http://schemas.microsoft.com/office/2019/extlst" xmlns:r="http://schemas.openxmlformats.org/officeDocument/2006/relationships" xmlns:m="http://schemas.openxmlformats.org/officeDocument/2006/math" xmlns:v="urn:schemas-microsoft-com:vml" xmlns:wp14="http://schemas.microsoft.com/office/word/2010/wordprocessingDrawing" xmlns:wp="http://schemas.openxmlformats.org/drawingml/2006/wordprocessingDrawing" xmlns:w10="urn:schemas-microsoft-com:office:word" xmlns:w="http://schemas.openxmlformats.org/wordprocessingml/2006/main" xmlns:w14="http://schemas.microsoft.com/office/word/2010/wordml" xmlns:w15="http://schemas.microsoft.com/office/word/2012/wordml" xmlns:w16cex="http://schemas.microsoft.com/office/word/2018/wordml/cex" xmlns:w16cid="http://schemas.microsoft.com/office/word/2016/wordml/cid" xmlns:w16="http://schemas.microsoft.com/office/word/2018/wordml" xmlns:w16sdtdh="http://schemas.microsoft.com/office/word/2020/wordml/sdtdatahash" xmlns:w16se="http://schemas.microsoft.com/office/word/2015/wordml/symex" xmlns:wpg="http://schemas.microsoft.com/office/word/2010/wordprocessingGroup" xmlns:wpi="http://schemas.microsoft.com/office/word/2010/wordprocessingInk" xmlns:wne="http://schemas.microsoft.com/office/word/2006/wordml" xmlns:wps="http://schemas.microsoft.com/office/word/2010/wordprocessingShape" mc:Ignorable="w14 w15 w16se w16cid w16 w16cex w16sdtdh wp14">
+<w:ftr xmlns:wpc="http://schemas.microsoft.com/office/word/2010/wordprocessingCanvas" xmlns:cx="http://schemas.microsoft.com/office/drawing/2014/chartex" xmlns:cx1="http://schemas.microsoft.com/office/drawing/2015/9/8/chartex" xmlns:cx2="http://schemas.microsoft.com/office/drawing/2015/10/21/chartex" xmlns:cx3="http://schemas.microsoft.com/office/drawing/2016/5/9/chartex" xmlns:cx4="http://schemas.microsoft.com/office/drawing/2016/5/10/chartex" xmlns:cx5="http://schemas.microsoft.com/office/drawing/2016/5/11/chartex" xmlns:cx6="http://schemas.microsoft.com/office/drawing/2016/5/12/chartex" xmlns:cx7="http://schemas.microsoft.com/office/drawing/2016/5/13/chartex" xmlns:cx8="http://schemas.microsoft.com/office/drawing/2016/5/14/chartex" xmlns:mc="http://schemas.openxmlformats.org/markup-compatibility/2006" xmlns:aink="http://schemas.microsoft.com/office/drawing/2016/ink" xmlns:am3d="http://schemas.microsoft.com/office/drawing/2017/model3d" xmlns:o="urn:schemas-microsoft-com:office:office" xmlns:oel="http://schemas.microsoft.com/office/2019/extlst" xmlns:r="http://schemas.openxmlformats.org/officeDocument/2006/relationships" xmlns:m="http://schemas.openxmlformats.org/officeDocument/2006/math" xmlns:v="urn:schemas-microsoft-com:vml" xmlns:wp14="http://schemas.microsoft.com/office/word/2010/wordprocessingDrawing" xmlns:wp="http://schemas.openxmlformats.org/drawingml/2006/wordprocessingDrawing" xmlns:w10="urn:schemas-microsoft-com:office:word" xmlns:w="http://schemas.openxmlformats.org/wordprocessingml/2006/main" xmlns:w14="http://schemas.microsoft.com/office/word/2010/wordml" xmlns:w15="http://schemas.microsoft.com/office/word/2012/wordml" xmlns:w16cex="http://schemas.microsoft.com/office/word/2018/wordml/cex" xmlns:w16cid="http://schemas.microsoft.com/office/word/2016/wordml/cid" xmlns:w16="http://schemas.microsoft.com/office/word/2018/wordml" xmlns:w16du="http://schemas.microsoft.com/office/word/2023/wordml/word16du" xmlns:w16sdtdh="http://schemas.microsoft.com/office/word/2020/wordml/sdtdatahash" xmlns:w16sdtfl="http://schemas.microsoft.com/office/word/2024/wordml/sdtformatlock" xmlns:w16se="http://schemas.microsoft.com/office/word/2015/wordml/symex" xmlns:wpg="http://schemas.microsoft.com/office/word/2010/wordprocessingGroup" xmlns:wpi="http://schemas.microsoft.com/office/word/2010/wordprocessingInk" xmlns:wne="http://schemas.microsoft.com/office/word/2006/wordml" xmlns:wps="http://schemas.microsoft.com/office/word/2010/wordprocessingShape" mc:Ignorable="w14 w15 w16se w16cid w16 w16cex w16sdtdh w16sdtfl w16du wp14">
   <w:p>
     <w:pPr>
       <w:pStyle w:val="Footer"/>
@@ -1215,7 +1313,7 @@
 </file>
 
 <file path=word/footer2.xml><?xml version="1.0" encoding="utf-8"?>
-<w:ftr xmlns:wpc="http://schemas.microsoft.com/office/word/2010/wordprocessingCanvas" xmlns:cx="http://schemas.microsoft.com/office/drawing/2014/chartex" xmlns:cx1="http://schemas.microsoft.com/office/drawing/2015/9/8/chartex" xmlns:cx2="http://schemas.microsoft.com/office/drawing/2015/10/21/chartex" xmlns:cx3="http://schemas.microsoft.com/office/drawing/2016/5/9/chartex" xmlns:cx4="http://schemas.microsoft.com/office/drawing/2016/5/10/chartex" xmlns:cx5="http://schemas.microsoft.com/office/drawing/2016/5/11/chartex" xmlns:cx6="http://schemas.microsoft.com/office/drawing/2016/5/12/chartex" xmlns:cx7="http://schemas.microsoft.com/office/drawing/2016/5/13/chartex" xmlns:cx8="http://schemas.microsoft.com/office/drawing/2016/5/14/chartex" xmlns:mc="http://schemas.openxmlformats.org/markup-compatibility/2006" xmlns:aink="http://schemas.microsoft.com/office/drawing/2016/ink" xmlns:am3d="http://schemas.microsoft.com/office/drawing/2017/model3d" xmlns:o="urn:schemas-microsoft-com:office:office" xmlns:oel="http://schemas.microsoft.com/office/2019/extlst" xmlns:r="http://schemas.openxmlformats.org/officeDocument/2006/relationships" xmlns:m="http://schemas.openxmlformats.org/officeDocument/2006/math" xmlns:v="urn:schemas-microsoft-com:vml" xmlns:wp14="http://schemas.microsoft.com/office/word/2010/wordprocessingDrawing" xmlns:wp="http://schemas.openxmlformats.org/drawingml/2006/wordprocessingDrawing" xmlns:w10="urn:schemas-microsoft-com:office:word" xmlns:w="http://schemas.openxmlformats.org/wordprocessingml/2006/main" xmlns:w14="http://schemas.microsoft.com/office/word/2010/wordml" xmlns:w15="http://schemas.microsoft.com/office/word/2012/wordml" xmlns:w16cex="http://schemas.microsoft.com/office/word/2018/wordml/cex" xmlns:w16cid="http://schemas.microsoft.com/office/word/2016/wordml/cid" xmlns:w16="http://schemas.microsoft.com/office/word/2018/wordml" xmlns:w16sdtdh="http://schemas.microsoft.com/office/word/2020/wordml/sdtdatahash" xmlns:w16se="http://schemas.microsoft.com/office/word/2015/wordml/symex" xmlns:wpg="http://schemas.microsoft.com/office/word/2010/wordprocessingGroup" xmlns:wpi="http://schemas.microsoft.com/office/word/2010/wordprocessingInk" xmlns:wne="http://schemas.microsoft.com/office/word/2006/wordml" xmlns:wps="http://schemas.microsoft.com/office/word/2010/wordprocessingShape" mc:Ignorable="w14 w15 w16se w16cid w16 w16cex w16sdtdh wp14">
+<w:ftr xmlns:wpc="http://schemas.microsoft.com/office/word/2010/wordprocessingCanvas" xmlns:cx="http://schemas.microsoft.com/office/drawing/2014/chartex" xmlns:cx1="http://schemas.microsoft.com/office/drawing/2015/9/8/chartex" xmlns:cx2="http://schemas.microsoft.com/office/drawing/2015/10/21/chartex" xmlns:cx3="http://schemas.microsoft.com/office/drawing/2016/5/9/chartex" xmlns:cx4="http://schemas.microsoft.com/office/drawing/2016/5/10/chartex" xmlns:cx5="http://schemas.microsoft.com/office/drawing/2016/5/11/chartex" xmlns:cx6="http://schemas.microsoft.com/office/drawing/2016/5/12/chartex" xmlns:cx7="http://schemas.microsoft.com/office/drawing/2016/5/13/chartex" xmlns:cx8="http://schemas.microsoft.com/office/drawing/2016/5/14/chartex" xmlns:mc="http://schemas.openxmlformats.org/markup-compatibility/2006" xmlns:aink="http://schemas.microsoft.com/office/drawing/2016/ink" xmlns:am3d="http://schemas.microsoft.com/office/drawing/2017/model3d" xmlns:o="urn:schemas-microsoft-com:office:office" xmlns:oel="http://schemas.microsoft.com/office/2019/extlst" xmlns:r="http://schemas.openxmlformats.org/officeDocument/2006/relationships" xmlns:m="http://schemas.openxmlformats.org/officeDocument/2006/math" xmlns:v="urn:schemas-microsoft-com:vml" xmlns:wp14="http://schemas.microsoft.com/office/word/2010/wordprocessingDrawing" xmlns:wp="http://schemas.openxmlformats.org/drawingml/2006/wordprocessingDrawing" xmlns:w10="urn:schemas-microsoft-com:office:word" xmlns:w="http://schemas.openxmlformats.org/wordprocessingml/2006/main" xmlns:w14="http://schemas.microsoft.com/office/word/2010/wordml" xmlns:w15="http://schemas.microsoft.com/office/word/2012/wordml" xmlns:w16cex="http://schemas.microsoft.com/office/word/2018/wordml/cex" xmlns:w16cid="http://schemas.microsoft.com/office/word/2016/wordml/cid" xmlns:w16="http://schemas.microsoft.com/office/word/2018/wordml" xmlns:w16du="http://schemas.microsoft.com/office/word/2023/wordml/word16du" xmlns:w16sdtdh="http://schemas.microsoft.com/office/word/2020/wordml/sdtdatahash" xmlns:w16sdtfl="http://schemas.microsoft.com/office/word/2024/wordml/sdtformatlock" xmlns:w16se="http://schemas.microsoft.com/office/word/2015/wordml/symex" xmlns:wpg="http://schemas.microsoft.com/office/word/2010/wordprocessingGroup" xmlns:wpi="http://schemas.microsoft.com/office/word/2010/wordprocessingInk" xmlns:wne="http://schemas.microsoft.com/office/word/2006/wordml" xmlns:wps="http://schemas.microsoft.com/office/word/2010/wordprocessingShape" mc:Ignorable="w14 w15 w16se w16cid w16 w16cex w16sdtdh w16sdtfl w16du wp14">
   <w:sdt>
     <w:sdtPr>
       <w:id w:val="1924688319"/>
@@ -1365,7 +1463,7 @@
 </file>
 
 <file path=word/footer3.xml><?xml version="1.0" encoding="utf-8"?>
-<w:ftr xmlns:wpc="http://schemas.microsoft.com/office/word/2010/wordprocessingCanvas" xmlns:cx="http://schemas.microsoft.com/office/drawing/2014/chartex" xmlns:cx1="http://schemas.microsoft.com/office/drawing/2015/9/8/chartex" xmlns:cx2="http://schemas.microsoft.com/office/drawing/2015/10/21/chartex" xmlns:cx3="http://schemas.microsoft.com/office/drawing/2016/5/9/chartex" xmlns:cx4="http://schemas.microsoft.com/office/drawing/2016/5/10/chartex" xmlns:cx5="http://schemas.microsoft.com/office/drawing/2016/5/11/chartex" xmlns:cx6="http://schemas.microsoft.com/office/drawing/2016/5/12/chartex" xmlns:cx7="http://schemas.microsoft.com/office/drawing/2016/5/13/chartex" xmlns:cx8="http://schemas.microsoft.com/office/drawing/2016/5/14/chartex" xmlns:mc="http://schemas.openxmlformats.org/markup-compatibility/2006" xmlns:aink="http://schemas.microsoft.com/office/drawing/2016/ink" xmlns:am3d="http://schemas.microsoft.com/office/drawing/2017/model3d" xmlns:o="urn:schemas-microsoft-com:office:office" xmlns:oel="http://schemas.microsoft.com/office/2019/extlst" xmlns:r="http://schemas.openxmlformats.org/officeDocument/2006/relationships" xmlns:m="http://schemas.openxmlformats.org/officeDocument/2006/math" xmlns:v="urn:schemas-microsoft-com:vml" xmlns:wp14="http://schemas.microsoft.com/office/word/2010/wordprocessingDrawing" xmlns:wp="http://schemas.openxmlformats.org/drawingml/2006/wordprocessingDrawing" xmlns:w10="urn:schemas-microsoft-com:office:word" xmlns:w="http://schemas.openxmlformats.org/wordprocessingml/2006/main" xmlns:w14="http://schemas.microsoft.com/office/word/2010/wordml" xmlns:w15="http://schemas.microsoft.com/office/word/2012/wordml" xmlns:w16cex="http://schemas.microsoft.com/office/word/2018/wordml/cex" xmlns:w16cid="http://schemas.microsoft.com/office/word/2016/wordml/cid" xmlns:w16="http://schemas.microsoft.com/office/word/2018/wordml" xmlns:w16sdtdh="http://schemas.microsoft.com/office/word/2020/wordml/sdtdatahash" xmlns:w16se="http://schemas.microsoft.com/office/word/2015/wordml/symex" xmlns:wpg="http://schemas.microsoft.com/office/word/2010/wordprocessingGroup" xmlns:wpi="http://schemas.microsoft.com/office/word/2010/wordprocessingInk" xmlns:wne="http://schemas.microsoft.com/office/word/2006/wordml" xmlns:wps="http://schemas.microsoft.com/office/word/2010/wordprocessingShape" mc:Ignorable="w14 w15 w16se w16cid w16 w16cex w16sdtdh wp14">
+<w:ftr xmlns:wpc="http://schemas.microsoft.com/office/word/2010/wordprocessingCanvas" xmlns:cx="http://schemas.microsoft.com/office/drawing/2014/chartex" xmlns:cx1="http://schemas.microsoft.com/office/drawing/2015/9/8/chartex" xmlns:cx2="http://schemas.microsoft.com/office/drawing/2015/10/21/chartex" xmlns:cx3="http://schemas.microsoft.com/office/drawing/2016/5/9/chartex" xmlns:cx4="http://schemas.microsoft.com/office/drawing/2016/5/10/chartex" xmlns:cx5="http://schemas.microsoft.com/office/drawing/2016/5/11/chartex" xmlns:cx6="http://schemas.microsoft.com/office/drawing/2016/5/12/chartex" xmlns:cx7="http://schemas.microsoft.com/office/drawing/2016/5/13/chartex" xmlns:cx8="http://schemas.microsoft.com/office/drawing/2016/5/14/chartex" xmlns:mc="http://schemas.openxmlformats.org/markup-compatibility/2006" xmlns:aink="http://schemas.microsoft.com/office/drawing/2016/ink" xmlns:am3d="http://schemas.microsoft.com/office/drawing/2017/model3d" xmlns:o="urn:schemas-microsoft-com:office:office" xmlns:oel="http://schemas.microsoft.com/office/2019/extlst" xmlns:r="http://schemas.openxmlformats.org/officeDocument/2006/relationships" xmlns:m="http://schemas.openxmlformats.org/officeDocument/2006/math" xmlns:v="urn:schemas-microsoft-com:vml" xmlns:wp14="http://schemas.microsoft.com/office/word/2010/wordprocessingDrawing" xmlns:wp="http://schemas.openxmlformats.org/drawingml/2006/wordprocessingDrawing" xmlns:w10="urn:schemas-microsoft-com:office:word" xmlns:w="http://schemas.openxmlformats.org/wordprocessingml/2006/main" xmlns:w14="http://schemas.microsoft.com/office/word/2010/wordml" xmlns:w15="http://schemas.microsoft.com/office/word/2012/wordml" xmlns:w16cex="http://schemas.microsoft.com/office/word/2018/wordml/cex" xmlns:w16cid="http://schemas.microsoft.com/office/word/2016/wordml/cid" xmlns:w16="http://schemas.microsoft.com/office/word/2018/wordml" xmlns:w16du="http://schemas.microsoft.com/office/word/2023/wordml/word16du" xmlns:w16sdtdh="http://schemas.microsoft.com/office/word/2020/wordml/sdtdatahash" xmlns:w16sdtfl="http://schemas.microsoft.com/office/word/2024/wordml/sdtformatlock" xmlns:w16se="http://schemas.microsoft.com/office/word/2015/wordml/symex" xmlns:wpg="http://schemas.microsoft.com/office/word/2010/wordprocessingGroup" xmlns:wpi="http://schemas.microsoft.com/office/word/2010/wordprocessingInk" xmlns:wne="http://schemas.microsoft.com/office/word/2006/wordml" xmlns:wps="http://schemas.microsoft.com/office/word/2010/wordprocessingShape" mc:Ignorable="w14 w15 w16se w16cid w16 w16cex w16sdtdh w16sdtfl w16du wp14">
   <w:sdt>
     <w:sdtPr>
       <w:id w:val="1924835919"/>
@@ -1515,7 +1613,7 @@
 </file>
 
 <file path=word/footnotes.xml><?xml version="1.0" encoding="utf-8"?>
-<w:footnotes xmlns:wpc="http://schemas.microsoft.com/office/word/2010/wordprocessingCanvas" xmlns:cx="http://schemas.microsoft.com/office/drawing/2014/chartex" xmlns:cx1="http://schemas.microsoft.com/office/drawing/2015/9/8/chartex" xmlns:cx2="http://schemas.microsoft.com/office/drawing/2015/10/21/chartex" xmlns:cx3="http://schemas.microsoft.com/office/drawing/2016/5/9/chartex" xmlns:cx4="http://schemas.microsoft.com/office/drawing/2016/5/10/chartex" xmlns:cx5="http://schemas.microsoft.com/office/drawing/2016/5/11/chartex" xmlns:cx6="http://schemas.microsoft.com/office/drawing/2016/5/12/chartex" xmlns:cx7="http://schemas.microsoft.com/office/drawing/2016/5/13/chartex" xmlns:cx8="http://schemas.microsoft.com/office/drawing/2016/5/14/chartex" xmlns:mc="http://schemas.openxmlformats.org/markup-compatibility/2006" xmlns:aink="http://schemas.microsoft.com/office/drawing/2016/ink" xmlns:am3d="http://schemas.microsoft.com/office/drawing/2017/model3d" xmlns:o="urn:schemas-microsoft-com:office:office" xmlns:oel="http://schemas.microsoft.com/office/2019/extlst" xmlns:r="http://schemas.openxmlformats.org/officeDocument/2006/relationships" xmlns:m="http://schemas.openxmlformats.org/officeDocument/2006/math" xmlns:v="urn:schemas-microsoft-com:vml" xmlns:wp14="http://schemas.microsoft.com/office/word/2010/wordprocessingDrawing" xmlns:wp="http://schemas.openxmlformats.org/drawingml/2006/wordprocessingDrawing" xmlns:w10="urn:schemas-microsoft-com:office:word" xmlns:w="http://schemas.openxmlformats.org/wordprocessingml/2006/main" xmlns:w14="http://schemas.microsoft.com/office/word/2010/wordml" xmlns:w15="http://schemas.microsoft.com/office/word/2012/wordml" xmlns:w16cex="http://schemas.microsoft.com/office/word/2018/wordml/cex" xmlns:w16cid="http://schemas.microsoft.com/office/word/2016/wordml/cid" xmlns:w16="http://schemas.microsoft.com/office/word/2018/wordml" xmlns:w16sdtdh="http://schemas.microsoft.com/office/word/2020/wordml/sdtdatahash" xmlns:w16se="http://schemas.microsoft.com/office/word/2015/wordml/symex" xmlns:wpg="http://schemas.microsoft.com/office/word/2010/wordprocessingGroup" xmlns:wpi="http://schemas.microsoft.com/office/word/2010/wordprocessingInk" xmlns:wne="http://schemas.microsoft.com/office/word/2006/wordml" xmlns:wps="http://schemas.microsoft.com/office/word/2010/wordprocessingShape" mc:Ignorable="w14 w15 w16se w16cid w16 w16cex w16sdtdh wp14">
+<w:footnotes xmlns:wpc="http://schemas.microsoft.com/office/word/2010/wordprocessingCanvas" xmlns:cx="http://schemas.microsoft.com/office/drawing/2014/chartex" xmlns:cx1="http://schemas.microsoft.com/office/drawing/2015/9/8/chartex" xmlns:cx2="http://schemas.microsoft.com/office/drawing/2015/10/21/chartex" xmlns:cx3="http://schemas.microsoft.com/office/drawing/2016/5/9/chartex" xmlns:cx4="http://schemas.microsoft.com/office/drawing/2016/5/10/chartex" xmlns:cx5="http://schemas.microsoft.com/office/drawing/2016/5/11/chartex" xmlns:cx6="http://schemas.microsoft.com/office/drawing/2016/5/12/chartex" xmlns:cx7="http://schemas.microsoft.com/office/drawing/2016/5/13/chartex" xmlns:cx8="http://schemas.microsoft.com/office/drawing/2016/5/14/chartex" xmlns:mc="http://schemas.openxmlformats.org/markup-compatibility/2006" xmlns:aink="http://schemas.microsoft.com/office/drawing/2016/ink" xmlns:am3d="http://schemas.microsoft.com/office/drawing/2017/model3d" xmlns:o="urn:schemas-microsoft-com:office:office" xmlns:oel="http://schemas.microsoft.com/office/2019/extlst" xmlns:r="http://schemas.openxmlformats.org/officeDocument/2006/relationships" xmlns:m="http://schemas.openxmlformats.org/officeDocument/2006/math" xmlns:v="urn:schemas-microsoft-com:vml" xmlns:wp14="http://schemas.microsoft.com/office/word/2010/wordprocessingDrawing" xmlns:wp="http://schemas.openxmlformats.org/drawingml/2006/wordprocessingDrawing" xmlns:w10="urn:schemas-microsoft-com:office:word" xmlns:w="http://schemas.openxmlformats.org/wordprocessingml/2006/main" xmlns:w14="http://schemas.microsoft.com/office/word/2010/wordml" xmlns:w15="http://schemas.microsoft.com/office/word/2012/wordml" xmlns:w16cex="http://schemas.microsoft.com/office/word/2018/wordml/cex" xmlns:w16cid="http://schemas.microsoft.com/office/word/2016/wordml/cid" xmlns:w16="http://schemas.microsoft.com/office/word/2018/wordml" xmlns:w16du="http://schemas.microsoft.com/office/word/2023/wordml/word16du" xmlns:w16sdtdh="http://schemas.microsoft.com/office/word/2020/wordml/sdtdatahash" xmlns:w16sdtfl="http://schemas.microsoft.com/office/word/2024/wordml/sdtformatlock" xmlns:w16se="http://schemas.microsoft.com/office/word/2015/wordml/symex" xmlns:wpg="http://schemas.microsoft.com/office/word/2010/wordprocessingGroup" xmlns:wpi="http://schemas.microsoft.com/office/word/2010/wordprocessingInk" xmlns:wne="http://schemas.microsoft.com/office/word/2006/wordml" xmlns:wps="http://schemas.microsoft.com/office/word/2010/wordprocessingShape" mc:Ignorable="w14 w15 w16se w16cid w16 w16cex w16sdtdh w16sdtfl w16du wp14">
   <w:footnote w:type="separator" w:id="-1">
     <w:p>
       <w:r>
@@ -1534,7 +1632,7 @@
 </file>
 
 <file path=word/header1.xml><?xml version="1.0" encoding="utf-8"?>
-<w:hdr xmlns:wpc="http://schemas.microsoft.com/office/word/2010/wordprocessingCanvas" xmlns:cx="http://schemas.microsoft.com/office/drawing/2014/chartex" xmlns:cx1="http://schemas.microsoft.com/office/drawing/2015/9/8/chartex" xmlns:cx2="http://schemas.microsoft.com/office/drawing/2015/10/21/chartex" xmlns:cx3="http://schemas.microsoft.com/office/drawing/2016/5/9/chartex" xmlns:cx4="http://schemas.microsoft.com/office/drawing/2016/5/10/chartex" xmlns:cx5="http://schemas.microsoft.com/office/drawing/2016/5/11/chartex" xmlns:cx6="http://schemas.microsoft.com/office/drawing/2016/5/12/chartex" xmlns:cx7="http://schemas.microsoft.com/office/drawing/2016/5/13/chartex" xmlns:cx8="http://schemas.microsoft.com/office/drawing/2016/5/14/chartex" xmlns:mc="http://schemas.openxmlformats.org/markup-compatibility/2006" xmlns:aink="http://schemas.microsoft.com/office/drawing/2016/ink" xmlns:am3d="http://schemas.microsoft.com/office/drawing/2017/model3d" xmlns:o="urn:schemas-microsoft-com:office:office" xmlns:oel="http://schemas.microsoft.com/office/2019/extlst" xmlns:r="http://schemas.openxmlformats.org/officeDocument/2006/relationships" xmlns:m="http://schemas.openxmlformats.org/officeDocument/2006/math" xmlns:v="urn:schemas-microsoft-com:vml" xmlns:wp14="http://schemas.microsoft.com/office/word/2010/wordprocessingDrawing" xmlns:wp="http://schemas.openxmlformats.org/drawingml/2006/wordprocessingDrawing" xmlns:w10="urn:schemas-microsoft-com:office:word" xmlns:w="http://schemas.openxmlformats.org/wordprocessingml/2006/main" xmlns:w14="http://schemas.microsoft.com/office/word/2010/wordml" xmlns:w15="http://schemas.microsoft.com/office/word/2012/wordml" xmlns:w16cex="http://schemas.microsoft.com/office/word/2018/wordml/cex" xmlns:w16cid="http://schemas.microsoft.com/office/word/2016/wordml/cid" xmlns:w16="http://schemas.microsoft.com/office/word/2018/wordml" xmlns:w16sdtdh="http://schemas.microsoft.com/office/word/2020/wordml/sdtdatahash" xmlns:w16se="http://schemas.microsoft.com/office/word/2015/wordml/symex" xmlns:wpg="http://schemas.microsoft.com/office/word/2010/wordprocessingGroup" xmlns:wpi="http://schemas.microsoft.com/office/word/2010/wordprocessingInk" xmlns:wne="http://schemas.microsoft.com/office/word/2006/wordml" xmlns:wps="http://schemas.microsoft.com/office/word/2010/wordprocessingShape" mc:Ignorable="w14 w15 w16se w16cid w16 w16cex w16sdtdh wp14">
+<w:hdr xmlns:wpc="http://schemas.microsoft.com/office/word/2010/wordprocessingCanvas" xmlns:cx="http://schemas.microsoft.com/office/drawing/2014/chartex" xmlns:cx1="http://schemas.microsoft.com/office/drawing/2015/9/8/chartex" xmlns:cx2="http://schemas.microsoft.com/office/drawing/2015/10/21/chartex" xmlns:cx3="http://schemas.microsoft.com/office/drawing/2016/5/9/chartex" xmlns:cx4="http://schemas.microsoft.com/office/drawing/2016/5/10/chartex" xmlns:cx5="http://schemas.microsoft.com/office/drawing/2016/5/11/chartex" xmlns:cx6="http://schemas.microsoft.com/office/drawing/2016/5/12/chartex" xmlns:cx7="http://schemas.microsoft.com/office/drawing/2016/5/13/chartex" xmlns:cx8="http://schemas.microsoft.com/office/drawing/2016/5/14/chartex" xmlns:mc="http://schemas.openxmlformats.org/markup-compatibility/2006" xmlns:aink="http://schemas.microsoft.com/office/drawing/2016/ink" xmlns:am3d="http://schemas.microsoft.com/office/drawing/2017/model3d" xmlns:o="urn:schemas-microsoft-com:office:office" xmlns:oel="http://schemas.microsoft.com/office/2019/extlst" xmlns:r="http://schemas.openxmlformats.org/officeDocument/2006/relationships" xmlns:m="http://schemas.openxmlformats.org/officeDocument/2006/math" xmlns:v="urn:schemas-microsoft-com:vml" xmlns:wp14="http://schemas.microsoft.com/office/word/2010/wordprocessingDrawing" xmlns:wp="http://schemas.openxmlformats.org/drawingml/2006/wordprocessingDrawing" xmlns:w10="urn:schemas-microsoft-com:office:word" xmlns:w="http://schemas.openxmlformats.org/wordprocessingml/2006/main" xmlns:w14="http://schemas.microsoft.com/office/word/2010/wordml" xmlns:w15="http://schemas.microsoft.com/office/word/2012/wordml" xmlns:w16cex="http://schemas.microsoft.com/office/word/2018/wordml/cex" xmlns:w16cid="http://schemas.microsoft.com/office/word/2016/wordml/cid" xmlns:w16="http://schemas.microsoft.com/office/word/2018/wordml" xmlns:w16du="http://schemas.microsoft.com/office/word/2023/wordml/word16du" xmlns:w16sdtdh="http://schemas.microsoft.com/office/word/2020/wordml/sdtdatahash" xmlns:w16sdtfl="http://schemas.microsoft.com/office/word/2024/wordml/sdtformatlock" xmlns:w16se="http://schemas.microsoft.com/office/word/2015/wordml/symex" xmlns:wpg="http://schemas.microsoft.com/office/word/2010/wordprocessingGroup" xmlns:wpi="http://schemas.microsoft.com/office/word/2010/wordprocessingInk" xmlns:wne="http://schemas.microsoft.com/office/word/2006/wordml" xmlns:wps="http://schemas.microsoft.com/office/word/2010/wordprocessingShape" mc:Ignorable="w14 w15 w16se w16cid w16 w16cex w16sdtdh w16sdtfl w16du wp14">
   <w:p>
     <w:pPr>
       <w:pStyle w:val="Header"/>
@@ -1544,7 +1642,7 @@
 </file>
 
 <file path=word/header2.xml><?xml version="1.0" encoding="utf-8"?>
-<w:hdr xmlns:wpc="http://schemas.microsoft.com/office/word/2010/wordprocessingCanvas" xmlns:cx="http://schemas.microsoft.com/office/drawing/2014/chartex" xmlns:cx1="http://schemas.microsoft.com/office/drawing/2015/9/8/chartex" xmlns:cx2="http://schemas.microsoft.com/office/drawing/2015/10/21/chartex" xmlns:cx3="http://schemas.microsoft.com/office/drawing/2016/5/9/chartex" xmlns:cx4="http://schemas.microsoft.com/office/drawing/2016/5/10/chartex" xmlns:cx5="http://schemas.microsoft.com/office/drawing/2016/5/11/chartex" xmlns:cx6="http://schemas.microsoft.com/office/drawing/2016/5/12/chartex" xmlns:cx7="http://schemas.microsoft.com/office/drawing/2016/5/13/chartex" xmlns:cx8="http://schemas.microsoft.com/office/drawing/2016/5/14/chartex" xmlns:mc="http://schemas.openxmlformats.org/markup-compatibility/2006" xmlns:aink="http://schemas.microsoft.com/office/drawing/2016/ink" xmlns:am3d="http://schemas.microsoft.com/office/drawing/2017/model3d" xmlns:o="urn:schemas-microsoft-com:office:office" xmlns:oel="http://schemas.microsoft.com/office/2019/extlst" xmlns:r="http://schemas.openxmlformats.org/officeDocument/2006/relationships" xmlns:m="http://schemas.openxmlformats.org/officeDocument/2006/math" xmlns:v="urn:schemas-microsoft-com:vml" xmlns:wp14="http://schemas.microsoft.com/office/word/2010/wordprocessingDrawing" xmlns:wp="http://schemas.openxmlformats.org/drawingml/2006/wordprocessingDrawing" xmlns:w10="urn:schemas-microsoft-com:office:word" xmlns:w="http://schemas.openxmlformats.org/wordprocessingml/2006/main" xmlns:w14="http://schemas.microsoft.com/office/word/2010/wordml" xmlns:w15="http://schemas.microsoft.com/office/word/2012/wordml" xmlns:w16cex="http://schemas.microsoft.com/office/word/2018/wordml/cex" xmlns:w16cid="http://schemas.microsoft.com/office/word/2016/wordml/cid" xmlns:w16="http://schemas.microsoft.com/office/word/2018/wordml" xmlns:w16sdtdh="http://schemas.microsoft.com/office/word/2020/wordml/sdtdatahash" xmlns:w16se="http://schemas.microsoft.com/office/word/2015/wordml/symex" xmlns:wpg="http://schemas.microsoft.com/office/word/2010/wordprocessingGroup" xmlns:wpi="http://schemas.microsoft.com/office/word/2010/wordprocessingInk" xmlns:wne="http://schemas.microsoft.com/office/word/2006/wordml" xmlns:wps="http://schemas.microsoft.com/office/word/2010/wordprocessingShape" mc:Ignorable="w14 w15 w16se w16cid w16 w16cex w16sdtdh wp14">
+<w:hdr xmlns:wpc="http://schemas.microsoft.com/office/word/2010/wordprocessingCanvas" xmlns:cx="http://schemas.microsoft.com/office/drawing/2014/chartex" xmlns:cx1="http://schemas.microsoft.com/office/drawing/2015/9/8/chartex" xmlns:cx2="http://schemas.microsoft.com/office/drawing/2015/10/21/chartex" xmlns:cx3="http://schemas.microsoft.com/office/drawing/2016/5/9/chartex" xmlns:cx4="http://schemas.microsoft.com/office/drawing/2016/5/10/chartex" xmlns:cx5="http://schemas.microsoft.com/office/drawing/2016/5/11/chartex" xmlns:cx6="http://schemas.microsoft.com/office/drawing/2016/5/12/chartex" xmlns:cx7="http://schemas.microsoft.com/office/drawing/2016/5/13/chartex" xmlns:cx8="http://schemas.microsoft.com/office/drawing/2016/5/14/chartex" xmlns:mc="http://schemas.openxmlformats.org/markup-compatibility/2006" xmlns:aink="http://schemas.microsoft.com/office/drawing/2016/ink" xmlns:am3d="http://schemas.microsoft.com/office/drawing/2017/model3d" xmlns:o="urn:schemas-microsoft-com:office:office" xmlns:oel="http://schemas.microsoft.com/office/2019/extlst" xmlns:r="http://schemas.openxmlformats.org/officeDocument/2006/relationships" xmlns:m="http://schemas.openxmlformats.org/officeDocument/2006/math" xmlns:v="urn:schemas-microsoft-com:vml" xmlns:wp14="http://schemas.microsoft.com/office/word/2010/wordprocessingDrawing" xmlns:wp="http://schemas.openxmlformats.org/drawingml/2006/wordprocessingDrawing" xmlns:w10="urn:schemas-microsoft-com:office:word" xmlns:w="http://schemas.openxmlformats.org/wordprocessingml/2006/main" xmlns:w14="http://schemas.microsoft.com/office/word/2010/wordml" xmlns:w15="http://schemas.microsoft.com/office/word/2012/wordml" xmlns:w16cex="http://schemas.microsoft.com/office/word/2018/wordml/cex" xmlns:w16cid="http://schemas.microsoft.com/office/word/2016/wordml/cid" xmlns:w16="http://schemas.microsoft.com/office/word/2018/wordml" xmlns:w16du="http://schemas.microsoft.com/office/word/2023/wordml/word16du" xmlns:w16sdtdh="http://schemas.microsoft.com/office/word/2020/wordml/sdtdatahash" xmlns:w16sdtfl="http://schemas.microsoft.com/office/word/2024/wordml/sdtformatlock" xmlns:w16se="http://schemas.microsoft.com/office/word/2015/wordml/symex" xmlns:wpg="http://schemas.microsoft.com/office/word/2010/wordprocessingGroup" xmlns:wpi="http://schemas.microsoft.com/office/word/2010/wordprocessingInk" xmlns:wne="http://schemas.microsoft.com/office/word/2006/wordml" xmlns:wps="http://schemas.microsoft.com/office/word/2010/wordprocessingShape" mc:Ignorable="w14 w15 w16se w16cid w16 w16cex w16sdtdh w16sdtfl w16du wp14">
   <w:p>
     <w:pPr>
       <w:pStyle w:val="Header"/>
@@ -1554,7 +1652,7 @@
 </file>
 
 <file path=word/header3.xml><?xml version="1.0" encoding="utf-8"?>
-<w:hdr xmlns:wpc="http://schemas.microsoft.com/office/word/2010/wordprocessingCanvas" xmlns:cx="http://schemas.microsoft.com/office/drawing/2014/chartex" xmlns:cx1="http://schemas.microsoft.com/office/drawing/2015/9/8/chartex" xmlns:cx2="http://schemas.microsoft.com/office/drawing/2015/10/21/chartex" xmlns:cx3="http://schemas.microsoft.com/office/drawing/2016/5/9/chartex" xmlns:cx4="http://schemas.microsoft.com/office/drawing/2016/5/10/chartex" xmlns:cx5="http://schemas.microsoft.com/office/drawing/2016/5/11/chartex" xmlns:cx6="http://schemas.microsoft.com/office/drawing/2016/5/12/chartex" xmlns:cx7="http://schemas.microsoft.com/office/drawing/2016/5/13/chartex" xmlns:cx8="http://schemas.microsoft.com/office/drawing/2016/5/14/chartex" xmlns:mc="http://schemas.openxmlformats.org/markup-compatibility/2006" xmlns:aink="http://schemas.microsoft.com/office/drawing/2016/ink" xmlns:am3d="http://schemas.microsoft.com/office/drawing/2017/model3d" xmlns:o="urn:schemas-microsoft-com:office:office" xmlns:oel="http://schemas.microsoft.com/office/2019/extlst" xmlns:r="http://schemas.openxmlformats.org/officeDocument/2006/relationships" xmlns:m="http://schemas.openxmlformats.org/officeDocument/2006/math" xmlns:v="urn:schemas-microsoft-com:vml" xmlns:wp14="http://schemas.microsoft.com/office/word/2010/wordprocessingDrawing" xmlns:wp="http://schemas.openxmlformats.org/drawingml/2006/wordprocessingDrawing" xmlns:w10="urn:schemas-microsoft-com:office:word" xmlns:w="http://schemas.openxmlformats.org/wordprocessingml/2006/main" xmlns:w14="http://schemas.microsoft.com/office/word/2010/wordml" xmlns:w15="http://schemas.microsoft.com/office/word/2012/wordml" xmlns:w16cex="http://schemas.microsoft.com/office/word/2018/wordml/cex" xmlns:w16cid="http://schemas.microsoft.com/office/word/2016/wordml/cid" xmlns:w16="http://schemas.microsoft.com/office/word/2018/wordml" xmlns:w16sdtdh="http://schemas.microsoft.com/office/word/2020/wordml/sdtdatahash" xmlns:w16se="http://schemas.microsoft.com/office/word/2015/wordml/symex" xmlns:wpg="http://schemas.microsoft.com/office/word/2010/wordprocessingGroup" xmlns:wpi="http://schemas.microsoft.com/office/word/2010/wordprocessingInk" xmlns:wne="http://schemas.microsoft.com/office/word/2006/wordml" xmlns:wps="http://schemas.microsoft.com/office/word/2010/wordprocessingShape" mc:Ignorable="w14 w15 w16se w16cid w16 w16cex w16sdtdh wp14">
+<w:hdr xmlns:wpc="http://schemas.microsoft.com/office/word/2010/wordprocessingCanvas" xmlns:cx="http://schemas.microsoft.com/office/drawing/2014/chartex" xmlns:cx1="http://schemas.microsoft.com/office/drawing/2015/9/8/chartex" xmlns:cx2="http://schemas.microsoft.com/office/drawing/2015/10/21/chartex" xmlns:cx3="http://schemas.microsoft.com/office/drawing/2016/5/9/chartex" xmlns:cx4="http://schemas.microsoft.com/office/drawing/2016/5/10/chartex" xmlns:cx5="http://schemas.microsoft.com/office/drawing/2016/5/11/chartex" xmlns:cx6="http://schemas.microsoft.com/office/drawing/2016/5/12/chartex" xmlns:cx7="http://schemas.microsoft.com/office/drawing/2016/5/13/chartex" xmlns:cx8="http://schemas.microsoft.com/office/drawing/2016/5/14/chartex" xmlns:mc="http://schemas.openxmlformats.org/markup-compatibility/2006" xmlns:aink="http://schemas.microsoft.com/office/drawing/2016/ink" xmlns:am3d="http://schemas.microsoft.com/office/drawing/2017/model3d" xmlns:o="urn:schemas-microsoft-com:office:office" xmlns:oel="http://schemas.microsoft.com/office/2019/extlst" xmlns:r="http://schemas.openxmlformats.org/officeDocument/2006/relationships" xmlns:m="http://schemas.openxmlformats.org/officeDocument/2006/math" xmlns:v="urn:schemas-microsoft-com:vml" xmlns:wp14="http://schemas.microsoft.com/office/word/2010/wordprocessingDrawing" xmlns:wp="http://schemas.openxmlformats.org/drawingml/2006/wordprocessingDrawing" xmlns:w10="urn:schemas-microsoft-com:office:word" xmlns:w="http://schemas.openxmlformats.org/wordprocessingml/2006/main" xmlns:w14="http://schemas.microsoft.com/office/word/2010/wordml" xmlns:w15="http://schemas.microsoft.com/office/word/2012/wordml" xmlns:w16cex="http://schemas.microsoft.com/office/word/2018/wordml/cex" xmlns:w16cid="http://schemas.microsoft.com/office/word/2016/wordml/cid" xmlns:w16="http://schemas.microsoft.com/office/word/2018/wordml" xmlns:w16du="http://schemas.microsoft.com/office/word/2023/wordml/word16du" xmlns:w16sdtdh="http://schemas.microsoft.com/office/word/2020/wordml/sdtdatahash" xmlns:w16sdtfl="http://schemas.microsoft.com/office/word/2024/wordml/sdtformatlock" xmlns:w16se="http://schemas.microsoft.com/office/word/2015/wordml/symex" xmlns:wpg="http://schemas.microsoft.com/office/word/2010/wordprocessingGroup" xmlns:wpi="http://schemas.microsoft.com/office/word/2010/wordprocessingInk" xmlns:wne="http://schemas.microsoft.com/office/word/2006/wordml" xmlns:wps="http://schemas.microsoft.com/office/word/2010/wordprocessingShape" mc:Ignorable="w14 w15 w16se w16cid w16 w16cex w16sdtdh w16sdtfl w16du wp14">
   <w:p>
     <w:pPr>
       <w:pStyle w:val="Header"/>
@@ -1564,7 +1662,7 @@
 </file>
 
 <file path=word/numbering.xml><?xml version="1.0" encoding="utf-8"?>
-<w:numbering xmlns:wpc="http://schemas.microsoft.com/office/word/2010/wordprocessingCanvas" xmlns:cx="http://schemas.microsoft.com/office/drawing/2014/chartex" xmlns:cx1="http://schemas.microsoft.com/office/drawing/2015/9/8/chartex" xmlns:cx2="http://schemas.microsoft.com/office/drawing/2015/10/21/chartex" xmlns:cx3="http://schemas.microsoft.com/office/drawing/2016/5/9/chartex" xmlns:cx4="http://schemas.microsoft.com/office/drawing/2016/5/10/chartex" xmlns:cx5="http://schemas.microsoft.com/office/drawing/2016/5/11/chartex" xmlns:cx6="http://schemas.microsoft.com/office/drawing/2016/5/12/chartex" xmlns:cx7="http://schemas.microsoft.com/office/drawing/2016/5/13/chartex" xmlns:cx8="http://schemas.microsoft.com/office/drawing/2016/5/14/chartex" xmlns:mc="http://schemas.openxmlformats.org/markup-compatibility/2006" xmlns:aink="http://schemas.microsoft.com/office/drawing/2016/ink" xmlns:am3d="http://schemas.microsoft.com/office/drawing/2017/model3d" xmlns:o="urn:schemas-microsoft-com:office:office" xmlns:oel="http://schemas.microsoft.com/office/2019/extlst" xmlns:r="http://schemas.openxmlformats.org/officeDocument/2006/relationships" xmlns:m="http://schemas.openxmlformats.org/officeDocument/2006/math" xmlns:v="urn:schemas-microsoft-com:vml" xmlns:wp14="http://schemas.microsoft.com/office/word/2010/wordprocessingDrawing" xmlns:wp="http://schemas.openxmlformats.org/drawingml/2006/wordprocessingDrawing" xmlns:w10="urn:schemas-microsoft-com:office:word" xmlns:w="http://schemas.openxmlformats.org/wordprocessingml/2006/main" xmlns:w14="http://schemas.microsoft.com/office/word/2010/wordml" xmlns:w15="http://schemas.microsoft.com/office/word/2012/wordml" xmlns:w16cex="http://schemas.microsoft.com/office/word/2018/wordml/cex" xmlns:w16cid="http://schemas.microsoft.com/office/word/2016/wordml/cid" xmlns:w16="http://schemas.microsoft.com/office/word/2018/wordml" xmlns:w16sdtdh="http://schemas.microsoft.com/office/word/2020/wordml/sdtdatahash" xmlns:w16se="http://schemas.microsoft.com/office/word/2015/wordml/symex" xmlns:wpg="http://schemas.microsoft.com/office/word/2010/wordprocessingGroup" xmlns:wpi="http://schemas.microsoft.com/office/word/2010/wordprocessingInk" xmlns:wne="http://schemas.microsoft.com/office/word/2006/wordml" xmlns:wps="http://schemas.microsoft.com/office/word/2010/wordprocessingShape" mc:Ignorable="w14 w15 w16se w16cid w16 w16cex w16sdtdh wp14">
+<w:numbering xmlns:wpc="http://schemas.microsoft.com/office/word/2010/wordprocessingCanvas" xmlns:cx="http://schemas.microsoft.com/office/drawing/2014/chartex" xmlns:cx1="http://schemas.microsoft.com/office/drawing/2015/9/8/chartex" xmlns:cx2="http://schemas.microsoft.com/office/drawing/2015/10/21/chartex" xmlns:cx3="http://schemas.microsoft.com/office/drawing/2016/5/9/chartex" xmlns:cx4="http://schemas.microsoft.com/office/drawing/2016/5/10/chartex" xmlns:cx5="http://schemas.microsoft.com/office/drawing/2016/5/11/chartex" xmlns:cx6="http://schemas.microsoft.com/office/drawing/2016/5/12/chartex" xmlns:cx7="http://schemas.microsoft.com/office/drawing/2016/5/13/chartex" xmlns:cx8="http://schemas.microsoft.com/office/drawing/2016/5/14/chartex" xmlns:mc="http://schemas.openxmlformats.org/markup-compatibility/2006" xmlns:aink="http://schemas.microsoft.com/office/drawing/2016/ink" xmlns:am3d="http://schemas.microsoft.com/office/drawing/2017/model3d" xmlns:o="urn:schemas-microsoft-com:office:office" xmlns:oel="http://schemas.microsoft.com/office/2019/extlst" xmlns:r="http://schemas.openxmlformats.org/officeDocument/2006/relationships" xmlns:m="http://schemas.openxmlformats.org/officeDocument/2006/math" xmlns:v="urn:schemas-microsoft-com:vml" xmlns:wp14="http://schemas.microsoft.com/office/word/2010/wordprocessingDrawing" xmlns:wp="http://schemas.openxmlformats.org/drawingml/2006/wordprocessingDrawing" xmlns:w10="urn:schemas-microsoft-com:office:word" xmlns:w="http://schemas.openxmlformats.org/wordprocessingml/2006/main" xmlns:w14="http://schemas.microsoft.com/office/word/2010/wordml" xmlns:w15="http://schemas.microsoft.com/office/word/2012/wordml" xmlns:w16cex="http://schemas.microsoft.com/office/word/2018/wordml/cex" xmlns:w16cid="http://schemas.microsoft.com/office/word/2016/wordml/cid" xmlns:w16="http://schemas.microsoft.com/office/word/2018/wordml" xmlns:w16du="http://schemas.microsoft.com/office/word/2023/wordml/word16du" xmlns:w16sdtdh="http://schemas.microsoft.com/office/word/2020/wordml/sdtdatahash" xmlns:w16sdtfl="http://schemas.microsoft.com/office/word/2024/wordml/sdtformatlock" xmlns:w16se="http://schemas.microsoft.com/office/word/2015/wordml/symex" xmlns:wpg="http://schemas.microsoft.com/office/word/2010/wordprocessingGroup" xmlns:wpi="http://schemas.microsoft.com/office/word/2010/wordprocessingInk" xmlns:wne="http://schemas.microsoft.com/office/word/2006/wordml" xmlns:wps="http://schemas.microsoft.com/office/word/2010/wordprocessingShape" mc:Ignorable="w14 w15 w16se w16cid w16 w16cex w16sdtdh w16sdtfl w16du wp14">
   <w:abstractNum w:abstractNumId="0" w15:restartNumberingAfterBreak="0">
     <w:nsid w:val="14CC1BC3"/>
     <w:multiLevelType w:val="multilevel"/>
@@ -4714,7 +4812,7 @@
 </file>
 
 <file path=word/styles.xml><?xml version="1.0" encoding="utf-8"?>
-<w:styles xmlns:mc="http://schemas.openxmlformats.org/markup-compatibility/2006" xmlns:r="http://schemas.openxmlformats.org/officeDocument/2006/relationships" xmlns:w="http://schemas.openxmlformats.org/wordprocessingml/2006/main" xmlns:w14="http://schemas.microsoft.com/office/word/2010/wordml" xmlns:w15="http://schemas.microsoft.com/office/word/2012/wordml" xmlns:w16cex="http://schemas.microsoft.com/office/word/2018/wordml/cex" xmlns:w16cid="http://schemas.microsoft.com/office/word/2016/wordml/cid" xmlns:w16="http://schemas.microsoft.com/office/word/2018/wordml" xmlns:w16sdtdh="http://schemas.microsoft.com/office/word/2020/wordml/sdtdatahash" xmlns:w16se="http://schemas.microsoft.com/office/word/2015/wordml/symex" mc:Ignorable="w14 w15 w16se w16cid w16 w16cex w16sdtdh">
+<w:styles xmlns:mc="http://schemas.openxmlformats.org/markup-compatibility/2006" xmlns:r="http://schemas.openxmlformats.org/officeDocument/2006/relationships" xmlns:w="http://schemas.openxmlformats.org/wordprocessingml/2006/main" xmlns:w14="http://schemas.microsoft.com/office/word/2010/wordml" xmlns:w15="http://schemas.microsoft.com/office/word/2012/wordml" xmlns:w16cex="http://schemas.microsoft.com/office/word/2018/wordml/cex" xmlns:w16cid="http://schemas.microsoft.com/office/word/2016/wordml/cid" xmlns:w16="http://schemas.microsoft.com/office/word/2018/wordml" xmlns:w16du="http://schemas.microsoft.com/office/word/2023/wordml/word16du" xmlns:w16sdtdh="http://schemas.microsoft.com/office/word/2020/wordml/sdtdatahash" xmlns:w16sdtfl="http://schemas.microsoft.com/office/word/2024/wordml/sdtformatlock" xmlns:w16se="http://schemas.microsoft.com/office/word/2015/wordml/symex" mc:Ignorable="w14 w15 w16se w16cid w16 w16cex w16sdtdh w16sdtfl w16du">
   <w:docDefaults>
     <w:rPrDefault>
       <w:rPr>

</xml_diff>